<commit_message>
docs: restore missing FR-08 to FR-23 SRS sections
</commit_message>
<xml_diff>
--- a/SRS.docx
+++ b/SRS.docx
@@ -11448,6 +11448,2040 @@
           <w:szCs w:val="24"/>
           <w:rtl w:val="0"/>
         </w:rPr>
+        <w:t xml:space="preserve">5.2 Snake Movement and Player Input</w:t>
+      </w:r>
+    </w:p>
+    <w:p>
+      <w:pPr>
+        <w:pStyle w:val="Heading3"/>
+        <w:keepNext w:val="0"/>
+        <w:keepLines w:val="0"/>
+        <w:spacing w:before="160" w:line="240" w:lineRule="auto"/>
+        <w:rPr>
+          <w:sz w:val="22"/>
+          <w:szCs w:val="22"/>
+        </w:rPr>
+      </w:pPr>
+      <w:r>
+        <w:rPr>
+          <w:sz w:val="22"/>
+          <w:szCs w:val="22"/>
+          <w:rtl w:val="0"/>
+        </w:rPr>
+        <w:t xml:space="preserve">5.2.1 Description and Priority</w:t>
+      </w:r>
+    </w:p>
+    <w:p>
+      <w:pPr>
+        <w:spacing w:after="120" w:line="240" w:lineRule="auto"/>
+        <w:rPr/>
+      </w:pPr>
+      <w:r>
+        <w:rPr>
+          <w:rtl w:val="0"/>
+        </w:rPr>
+        <w:t xml:space="preserve">This feature provides responsive real-time control of the snake during gameplay. The player selects a direction using the arrow keys or WASD keys; the game applies legal direction changes at the next movement tick. Priority: HIGH.</w:t>
+      </w:r>
+    </w:p>
+    <w:p>
+      <w:pPr>
+        <w:pStyle w:val="Heading3"/>
+        <w:keepNext w:val="0"/>
+        <w:keepLines w:val="0"/>
+        <w:spacing w:before="160" w:line="240" w:lineRule="auto"/>
+        <w:rPr>
+          <w:sz w:val="22"/>
+          <w:szCs w:val="22"/>
+        </w:rPr>
+      </w:pPr>
+      <w:r>
+        <w:rPr>
+          <w:sz w:val="22"/>
+          <w:szCs w:val="22"/>
+          <w:rtl w:val="0"/>
+        </w:rPr>
+        <w:t xml:space="preserve">5.2.2 Stimulus/Response Sequences</w:t>
+      </w:r>
+    </w:p>
+    <w:p>
+      <w:pPr>
+        <w:spacing w:after="80" w:line="240" w:lineRule="auto"/>
+        <w:ind w:left="720" w:firstLine="0"/>
+        <w:rPr/>
+      </w:pPr>
+      <w:r>
+        <w:rPr>
+          <w:b w:val="1"/>
+          <w:bCs w:val="1"/>
+          <w:rtl w:val="0"/>
+        </w:rPr>
+        <w:t xml:space="preserve">• Player presses an arrow key or WASD key while PLAYING → System changes the snake direction at the next tick unless the requested direction is opposite to the current direction.</w:t>
+      </w:r>
+      <w:r>
+        <w:rPr>
+          <w:rtl w:val="0"/>
+        </w:rPr>
+        <w:t xml:space="preserve"/>
+      </w:r>
+    </w:p>
+    <w:p>
+      <w:pPr>
+        <w:spacing w:after="80" w:line="240" w:lineRule="auto"/>
+        <w:ind w:left="720" w:firstLine="0"/>
+        <w:rPr/>
+      </w:pPr>
+      <w:r>
+        <w:rPr>
+          <w:b w:val="1"/>
+          <w:bCs w:val="1"/>
+          <w:rtl w:val="0"/>
+        </w:rPr>
+        <w:t xml:space="preserve">• Movement tick occurs → System advances the snake by one grid cell in its current direction and renders the head distinctly from the body.</w:t>
+      </w:r>
+      <w:r>
+        <w:rPr>
+          <w:rtl w:val="0"/>
+        </w:rPr>
+        <w:t xml:space="preserve"/>
+      </w:r>
+    </w:p>
+    <w:p>
+      <w:pPr>
+        <w:pStyle w:val="Heading3"/>
+        <w:keepNext w:val="0"/>
+        <w:keepLines w:val="0"/>
+        <w:spacing w:before="160" w:line="240" w:lineRule="auto"/>
+        <w:rPr>
+          <w:sz w:val="22"/>
+          <w:szCs w:val="22"/>
+        </w:rPr>
+      </w:pPr>
+      <w:r>
+        <w:rPr>
+          <w:sz w:val="22"/>
+          <w:szCs w:val="22"/>
+          <w:rtl w:val="0"/>
+        </w:rPr>
+        <w:t xml:space="preserve">5.2.3 Functional Requirements</w:t>
+      </w:r>
+    </w:p>
+    <w:sdt>
+      <w:sdtPr>
+        <w:lock w:val="contentLocked"/>
+        <w:id w:val="-122314717"/>
+        <w:tag w:val="goog_rdk_7"/>
+      </w:sdtPr>
+      <w:sdtContent>
+        <w:tbl>
+          <w:tblPr>
+            <w:tblStyle w:val="Table10"/>
+            <w:tblW w:w="9200.0" w:type="dxa"/>
+            <w:jc w:val="left"/>
+            <w:tblBorders>
+              <w:top w:color="000000" w:space="0" w:sz="4" w:val="single"/>
+              <w:left w:color="000000" w:space="0" w:sz="4" w:val="single"/>
+              <w:bottom w:color="000000" w:space="0" w:sz="4" w:val="single"/>
+              <w:right w:color="000000" w:space="0" w:sz="4" w:val="single"/>
+              <w:insideH w:color="000000" w:space="0" w:sz="4" w:val="single"/>
+              <w:insideV w:color="000000" w:space="0" w:sz="4" w:val="single"/>
+            </w:tblBorders>
+            <w:tblLayout w:type="fixed"/>
+            <w:tblLook w:val="0000"/>
+          </w:tblPr>
+          <w:tblGrid>
+            <w:gridCol w:w="1000"/>
+            <w:gridCol w:w="7000"/>
+            <w:gridCol w:w="1200"/>
+            <w:tblGridChange w:id="0">
+              <w:tblGrid>
+                <w:gridCol w:w="1000"/>
+                <w:gridCol w:w="7000"/>
+                <w:gridCol w:w="1200"/>
+              </w:tblGrid>
+            </w:tblGridChange>
+          </w:tblGrid>
+          <w:tr>
+            <w:trPr>
+              <w:cantSplit w:val="0"/>
+              <w:tblHeader w:val="1"/>
+            </w:trPr>
+            <w:tc>
+              <w:tcPr>
+                <w:shd w:fill="d9d9d9" w:val="clear"/>
+              </w:tcPr>
+              <w:p>
+                <w:pPr>
+                  <w:spacing w:after="120" w:line="240" w:lineRule="auto"/>
+                  <w:rPr/>
+                </w:pPr>
+                <w:r>
+                  <w:rPr>
+                    <w:b w:val="1"/>
+                    <w:bCs w:val="1"/>
+                    <w:sz w:val="20"/>
+                    <w:szCs w:val="20"/>
+                    <w:rtl w:val="0"/>
+                  </w:rPr>
+                  <w:t xml:space="preserve">Req ID</w:t>
+                </w:r>
+                <w:r>
+                  <w:rPr>
+                    <w:rtl w:val="0"/>
+                  </w:rPr>
+                </w:r>
+              </w:p>
+            </w:tc>
+            <w:tc>
+              <w:tcPr>
+                <w:shd w:fill="d9d9d9" w:val="clear"/>
+              </w:tcPr>
+              <w:p>
+                <w:pPr>
+                  <w:spacing w:after="120" w:line="240" w:lineRule="auto"/>
+                  <w:rPr/>
+                </w:pPr>
+                <w:r>
+                  <w:rPr>
+                    <w:b w:val="1"/>
+                    <w:bCs w:val="1"/>
+                    <w:sz w:val="20"/>
+                    <w:szCs w:val="20"/>
+                    <w:rtl w:val="0"/>
+                  </w:rPr>
+                  <w:t xml:space="preserve">Requirement</w:t>
+                </w:r>
+                <w:r>
+                  <w:rPr>
+                    <w:rtl w:val="0"/>
+                  </w:rPr>
+                </w:r>
+              </w:p>
+            </w:tc>
+            <w:tc>
+              <w:tcPr>
+                <w:shd w:fill="d9d9d9" w:val="clear"/>
+              </w:tcPr>
+              <w:p>
+                <w:pPr>
+                  <w:spacing w:after="120" w:line="240" w:lineRule="auto"/>
+                  <w:rPr/>
+                </w:pPr>
+                <w:r>
+                  <w:rPr>
+                    <w:b w:val="1"/>
+                    <w:bCs w:val="1"/>
+                    <w:sz w:val="20"/>
+                    <w:szCs w:val="20"/>
+                    <w:rtl w:val="0"/>
+                  </w:rPr>
+                  <w:t xml:space="preserve">Priority</w:t>
+                </w:r>
+                <w:r>
+                  <w:rPr>
+                    <w:rtl w:val="0"/>
+                  </w:rPr>
+                </w:r>
+              </w:p>
+            </w:tc>
+          </w:tr>
+          <w:tr>
+            <w:trPr>
+              <w:cantSplit w:val="0"/>
+              <w:tblHeader w:val="0"/>
+            </w:trPr>
+            <w:tc>
+              <w:tcPr>
+                <w:shd w:fill="ffffff" w:val="clear"/>
+              </w:tcPr>
+              <w:p>
+                <w:pPr>
+                  <w:spacing w:after="120" w:line="240" w:lineRule="auto"/>
+                  <w:rPr/>
+                </w:pPr>
+                <w:r>
+                  <w:rPr>
+                    <w:sz w:val="20"/>
+                    <w:szCs w:val="20"/>
+                    <w:rtl w:val="0"/>
+                  </w:rPr>
+                  <w:t xml:space="preserve">FR-08</w:t>
+                </w:r>
+                <w:r>
+                  <w:rPr>
+                    <w:rtl w:val="0"/>
+                  </w:rPr>
+                </w:r>
+              </w:p>
+            </w:tc>
+            <w:tc>
+              <w:tcPr>
+                <w:shd w:fill="ffffff" w:val="clear"/>
+              </w:tcPr>
+              <w:p>
+                <w:pPr>
+                  <w:spacing w:after="120" w:line="240" w:lineRule="auto"/>
+                  <w:rPr/>
+                </w:pPr>
+                <w:r>
+                  <w:rPr>
+                    <w:sz w:val="20"/>
+                    <w:szCs w:val="20"/>
+                    <w:rtl w:val="0"/>
+                  </w:rPr>
+                  <w:t xml:space="preserve">The system shall set the initial snake movement tick interval according to difficulty: Easy = 150 ms, Medium = 100 ms, Hard = 70 ms.</w:t>
+                </w:r>
+                <w:r>
+                  <w:rPr>
+                    <w:rtl w:val="0"/>
+                  </w:rPr>
+                </w:r>
+              </w:p>
+            </w:tc>
+            <w:tc>
+              <w:tcPr>
+                <w:shd w:fill="ffffff" w:val="clear"/>
+              </w:tcPr>
+              <w:p>
+                <w:pPr>
+                  <w:spacing w:after="120" w:line="240" w:lineRule="auto"/>
+                  <w:rPr/>
+                </w:pPr>
+                <w:r>
+                  <w:rPr>
+                    <w:sz w:val="20"/>
+                    <w:szCs w:val="20"/>
+                    <w:rtl w:val="0"/>
+                  </w:rPr>
+                  <w:t xml:space="preserve">High</w:t>
+                </w:r>
+                <w:r>
+                  <w:rPr>
+                    <w:rtl w:val="0"/>
+                  </w:rPr>
+                </w:r>
+              </w:p>
+            </w:tc>
+          </w:tr>
+          <w:tr>
+            <w:trPr>
+              <w:cantSplit w:val="0"/>
+              <w:tblHeader w:val="0"/>
+            </w:trPr>
+            <w:tc>
+              <w:tcPr>
+                <w:shd w:fill="ffffff" w:val="clear"/>
+              </w:tcPr>
+              <w:p>
+                <w:pPr>
+                  <w:spacing w:after="120" w:line="240" w:lineRule="auto"/>
+                  <w:rPr/>
+                </w:pPr>
+                <w:r>
+                  <w:rPr>
+                    <w:sz w:val="20"/>
+                    <w:szCs w:val="20"/>
+                    <w:rtl w:val="0"/>
+                  </w:rPr>
+                  <w:t xml:space="preserve">FR-09</w:t>
+                </w:r>
+                <w:r>
+                  <w:rPr>
+                    <w:rtl w:val="0"/>
+                  </w:rPr>
+                </w:r>
+              </w:p>
+            </w:tc>
+            <w:tc>
+              <w:tcPr>
+                <w:shd w:fill="ffffff" w:val="clear"/>
+              </w:tcPr>
+              <w:p>
+                <w:pPr>
+                  <w:spacing w:after="120" w:line="240" w:lineRule="auto"/>
+                  <w:rPr/>
+                </w:pPr>
+                <w:r>
+                  <w:rPr>
+                    <w:sz w:val="20"/>
+                    <w:szCs w:val="20"/>
+                    <w:rtl w:val="0"/>
+                  </w:rPr>
+                  <w:t xml:space="preserve">The system shall accept both Arrow keys and WASD keys as directional input during PLAYING state.</w:t>
+                </w:r>
+                <w:r>
+                  <w:rPr>
+                    <w:rtl w:val="0"/>
+                  </w:rPr>
+                </w:r>
+              </w:p>
+            </w:tc>
+            <w:tc>
+              <w:tcPr>
+                <w:shd w:fill="ffffff" w:val="clear"/>
+              </w:tcPr>
+              <w:p>
+                <w:pPr>
+                  <w:spacing w:after="120" w:line="240" w:lineRule="auto"/>
+                  <w:rPr/>
+                </w:pPr>
+                <w:r>
+                  <w:rPr>
+                    <w:sz w:val="20"/>
+                    <w:szCs w:val="20"/>
+                    <w:rtl w:val="0"/>
+                  </w:rPr>
+                  <w:t xml:space="preserve">High</w:t>
+                </w:r>
+                <w:r>
+                  <w:rPr>
+                    <w:rtl w:val="0"/>
+                  </w:rPr>
+                </w:r>
+              </w:p>
+            </w:tc>
+          </w:tr>
+          <w:tr>
+            <w:trPr>
+              <w:cantSplit w:val="0"/>
+              <w:tblHeader w:val="0"/>
+            </w:trPr>
+            <w:tc>
+              <w:tcPr>
+                <w:shd w:fill="ffffff" w:val="clear"/>
+              </w:tcPr>
+              <w:p>
+                <w:pPr>
+                  <w:spacing w:after="120" w:line="240" w:lineRule="auto"/>
+                  <w:rPr/>
+                </w:pPr>
+                <w:r>
+                  <w:rPr>
+                    <w:sz w:val="20"/>
+                    <w:szCs w:val="20"/>
+                    <w:rtl w:val="0"/>
+                  </w:rPr>
+                  <w:t xml:space="preserve">FR-10</w:t>
+                </w:r>
+                <w:r>
+                  <w:rPr>
+                    <w:rtl w:val="0"/>
+                  </w:rPr>
+                </w:r>
+              </w:p>
+            </w:tc>
+            <w:tc>
+              <w:tcPr>
+                <w:shd w:fill="ffffff" w:val="clear"/>
+              </w:tcPr>
+              <w:p>
+                <w:pPr>
+                  <w:spacing w:after="120" w:line="240" w:lineRule="auto"/>
+                  <w:rPr/>
+                </w:pPr>
+                <w:r>
+                  <w:rPr>
+                    <w:sz w:val="20"/>
+                    <w:szCs w:val="20"/>
+                    <w:rtl w:val="0"/>
+                  </w:rPr>
+                  <w:t xml:space="preserve">The system shall reject a requested direction that is directly opposite to the snake’s current direction.</w:t>
+                </w:r>
+                <w:r>
+                  <w:rPr>
+                    <w:rtl w:val="0"/>
+                  </w:rPr>
+                </w:r>
+              </w:p>
+            </w:tc>
+            <w:tc>
+              <w:tcPr>
+                <w:shd w:fill="ffffff" w:val="clear"/>
+              </w:tcPr>
+              <w:p>
+                <w:pPr>
+                  <w:spacing w:after="120" w:line="240" w:lineRule="auto"/>
+                  <w:rPr/>
+                </w:pPr>
+                <w:r>
+                  <w:rPr>
+                    <w:sz w:val="20"/>
+                    <w:szCs w:val="20"/>
+                    <w:rtl w:val="0"/>
+                  </w:rPr>
+                  <w:t xml:space="preserve">High</w:t>
+                </w:r>
+                <w:r>
+                  <w:rPr>
+                    <w:rtl w:val="0"/>
+                  </w:rPr>
+                </w:r>
+              </w:p>
+            </w:tc>
+          </w:tr>
+          <w:tr>
+            <w:trPr>
+              <w:cantSplit w:val="0"/>
+              <w:tblHeader w:val="0"/>
+            </w:trPr>
+            <w:tc>
+              <w:tcPr>
+                <w:shd w:fill="ffffff" w:val="clear"/>
+              </w:tcPr>
+              <w:p>
+                <w:pPr>
+                  <w:spacing w:after="120" w:line="240" w:lineRule="auto"/>
+                  <w:rPr/>
+                </w:pPr>
+                <w:r>
+                  <w:rPr>
+                    <w:sz w:val="20"/>
+                    <w:szCs w:val="20"/>
+                    <w:rtl w:val="0"/>
+                  </w:rPr>
+                  <w:t xml:space="preserve">FR-11</w:t>
+                </w:r>
+                <w:r>
+                  <w:rPr>
+                    <w:rtl w:val="0"/>
+                  </w:rPr>
+                </w:r>
+              </w:p>
+            </w:tc>
+            <w:tc>
+              <w:tcPr>
+                <w:shd w:fill="ffffff" w:val="clear"/>
+              </w:tcPr>
+              <w:p>
+                <w:pPr>
+                  <w:spacing w:after="120" w:line="240" w:lineRule="auto"/>
+                  <w:rPr/>
+                </w:pPr>
+                <w:r>
+                  <w:rPr>
+                    <w:sz w:val="20"/>
+                    <w:szCs w:val="20"/>
+                    <w:rtl w:val="0"/>
+                  </w:rPr>
+                  <w:t xml:space="preserve">The system shall move the snake exactly one grid cell on every movement tick.</w:t>
+                </w:r>
+                <w:r>
+                  <w:rPr>
+                    <w:rtl w:val="0"/>
+                  </w:rPr>
+                </w:r>
+              </w:p>
+            </w:tc>
+            <w:tc>
+              <w:tcPr>
+                <w:shd w:fill="ffffff" w:val="clear"/>
+              </w:tcPr>
+              <w:p>
+                <w:pPr>
+                  <w:spacing w:after="120" w:line="240" w:lineRule="auto"/>
+                  <w:rPr/>
+                </w:pPr>
+                <w:r>
+                  <w:rPr>
+                    <w:sz w:val="20"/>
+                    <w:szCs w:val="20"/>
+                    <w:rtl w:val="0"/>
+                  </w:rPr>
+                  <w:t xml:space="preserve">High</w:t>
+                </w:r>
+                <w:r>
+                  <w:rPr>
+                    <w:rtl w:val="0"/>
+                  </w:rPr>
+                </w:r>
+              </w:p>
+            </w:tc>
+          </w:tr>
+          <w:tr>
+            <w:trPr>
+              <w:cantSplit w:val="0"/>
+              <w:tblHeader w:val="0"/>
+            </w:trPr>
+            <w:tc>
+              <w:tcPr>
+                <w:shd w:fill="ffffff" w:val="clear"/>
+              </w:tcPr>
+              <w:p>
+                <w:pPr>
+                  <w:spacing w:after="120" w:line="240" w:lineRule="auto"/>
+                  <w:rPr/>
+                </w:pPr>
+                <w:r>
+                  <w:rPr>
+                    <w:sz w:val="20"/>
+                    <w:szCs w:val="20"/>
+                    <w:rtl w:val="0"/>
+                  </w:rPr>
+                  <w:t xml:space="preserve">FR-12</w:t>
+                </w:r>
+                <w:r>
+                  <w:rPr>
+                    <w:rtl w:val="0"/>
+                  </w:rPr>
+                </w:r>
+              </w:p>
+            </w:tc>
+            <w:tc>
+              <w:tcPr>
+                <w:shd w:fill="ffffff" w:val="clear"/>
+              </w:tcPr>
+              <w:p>
+                <w:pPr>
+                  <w:spacing w:after="120" w:line="240" w:lineRule="auto"/>
+                  <w:rPr/>
+                </w:pPr>
+                <w:r>
+                  <w:rPr>
+                    <w:sz w:val="20"/>
+                    <w:szCs w:val="20"/>
+                    <w:rtl w:val="0"/>
+                  </w:rPr>
+                  <w:t xml:space="preserve">The system shall render the snake head visually distinct from its body segments.</w:t>
+                </w:r>
+                <w:r>
+                  <w:rPr>
+                    <w:rtl w:val="0"/>
+                  </w:rPr>
+                </w:r>
+              </w:p>
+            </w:tc>
+            <w:tc>
+              <w:tcPr>
+                <w:shd w:fill="ffffff" w:val="clear"/>
+              </w:tcPr>
+              <w:p>
+                <w:pPr>
+                  <w:spacing w:after="120" w:line="240" w:lineRule="auto"/>
+                  <w:rPr/>
+                </w:pPr>
+                <w:r>
+                  <w:rPr>
+                    <w:sz w:val="20"/>
+                    <w:szCs w:val="20"/>
+                    <w:rtl w:val="0"/>
+                  </w:rPr>
+                  <w:t xml:space="preserve">High</w:t>
+                </w:r>
+                <w:r>
+                  <w:rPr>
+                    <w:rtl w:val="0"/>
+                  </w:rPr>
+                </w:r>
+              </w:p>
+            </w:tc>
+          </w:tr>
+        </w:tbl>
+      </w:sdtContent>
+    </w:sdt>
+    <w:p>
+      <w:pPr>
+        <w:pStyle w:val="Heading2"/>
+        <w:keepNext w:val="0"/>
+        <w:keepLines w:val="0"/>
+        <w:spacing w:after="100" w:before="200" w:line="240" w:lineRule="auto"/>
+        <w:rPr>
+          <w:b w:val="1"/>
+          <w:bCs w:val="1"/>
+          <w:color w:val="003366"/>
+          <w:sz w:val="24"/>
+          <w:szCs w:val="24"/>
+        </w:rPr>
+      </w:pPr>
+      <w:r>
+        <w:rPr>
+          <w:b w:val="1"/>
+          <w:bCs w:val="1"/>
+          <w:color w:val="003366"/>
+          <w:sz w:val="24"/>
+          <w:szCs w:val="24"/>
+          <w:rtl w:val="0"/>
+        </w:rPr>
+        <w:t xml:space="preserve">5.3 Food Generation and Scoring</w:t>
+      </w:r>
+    </w:p>
+    <w:p>
+      <w:pPr>
+        <w:pStyle w:val="Heading3"/>
+        <w:keepNext w:val="0"/>
+        <w:keepLines w:val="0"/>
+        <w:spacing w:before="160" w:line="240" w:lineRule="auto"/>
+        <w:rPr>
+          <w:sz w:val="22"/>
+          <w:szCs w:val="22"/>
+        </w:rPr>
+      </w:pPr>
+      <w:r>
+        <w:rPr>
+          <w:sz w:val="22"/>
+          <w:szCs w:val="22"/>
+          <w:rtl w:val="0"/>
+        </w:rPr>
+        <w:t xml:space="preserve">5.3.1 Description and Priority</w:t>
+      </w:r>
+    </w:p>
+    <w:p>
+      <w:pPr>
+        <w:spacing w:after="120" w:line="240" w:lineRule="auto"/>
+        <w:rPr/>
+      </w:pPr>
+      <w:r>
+        <w:rPr>
+          <w:rtl w:val="0"/>
+        </w:rPr>
+        <w:t xml:space="preserve">This feature manages food placement, scoring, snake growth, and score presentation. Food must always appear in a valid empty cell so that the player can safely consume it. Priority: HIGH.</w:t>
+      </w:r>
+    </w:p>
+    <w:p>
+      <w:pPr>
+        <w:pStyle w:val="Heading3"/>
+        <w:keepNext w:val="0"/>
+        <w:keepLines w:val="0"/>
+        <w:spacing w:before="160" w:line="240" w:lineRule="auto"/>
+        <w:rPr>
+          <w:sz w:val="22"/>
+          <w:szCs w:val="22"/>
+        </w:rPr>
+      </w:pPr>
+      <w:r>
+        <w:rPr>
+          <w:sz w:val="22"/>
+          <w:szCs w:val="22"/>
+          <w:rtl w:val="0"/>
+        </w:rPr>
+        <w:t xml:space="preserve">5.3.2 Stimulus/Response Sequences</w:t>
+      </w:r>
+    </w:p>
+    <w:p>
+      <w:pPr>
+        <w:spacing w:after="80" w:line="240" w:lineRule="auto"/>
+        <w:ind w:left="720" w:firstLine="0"/>
+        <w:rPr/>
+      </w:pPr>
+      <w:r>
+        <w:rPr>
+          <w:b w:val="1"/>
+          <w:bCs w:val="1"/>
+          <w:rtl w:val="0"/>
+        </w:rPr>
+        <w:t xml:space="preserve">• A new game starts or the snake consumes food → System places exactly one food item at a random unoccupied grid cell.</w:t>
+      </w:r>
+      <w:r>
+        <w:rPr>
+          <w:rtl w:val="0"/>
+        </w:rPr>
+        <w:t xml:space="preserve"/>
+      </w:r>
+    </w:p>
+    <w:p>
+      <w:pPr>
+        <w:spacing w:after="80" w:line="240" w:lineRule="auto"/>
+        <w:ind w:left="720" w:firstLine="0"/>
+        <w:rPr/>
+      </w:pPr>
+      <w:r>
+        <w:rPr>
+          <w:b w:val="1"/>
+          <w:bCs w:val="1"/>
+          <w:rtl w:val="0"/>
+        </w:rPr>
+        <w:t xml:space="preserve">• Snake head reaches the food cell → System grows the snake, increases the score, updates the HUD, and generates replacement food.</w:t>
+      </w:r>
+      <w:r>
+        <w:rPr>
+          <w:rtl w:val="0"/>
+        </w:rPr>
+        <w:t xml:space="preserve"/>
+      </w:r>
+    </w:p>
+    <w:p>
+      <w:pPr>
+        <w:pStyle w:val="Heading3"/>
+        <w:keepNext w:val="0"/>
+        <w:keepLines w:val="0"/>
+        <w:spacing w:before="160" w:line="240" w:lineRule="auto"/>
+        <w:rPr>
+          <w:sz w:val="22"/>
+          <w:szCs w:val="22"/>
+        </w:rPr>
+      </w:pPr>
+      <w:r>
+        <w:rPr>
+          <w:sz w:val="22"/>
+          <w:szCs w:val="22"/>
+          <w:rtl w:val="0"/>
+        </w:rPr>
+        <w:t xml:space="preserve">5.3.3 Functional Requirements</w:t>
+      </w:r>
+    </w:p>
+    <w:sdt>
+      <w:sdtPr>
+        <w:lock w:val="contentLocked"/>
+        <w:id w:val="-122314717"/>
+        <w:tag w:val="goog_rdk_7"/>
+      </w:sdtPr>
+      <w:sdtContent>
+        <w:tbl>
+          <w:tblPr>
+            <w:tblStyle w:val="Table10"/>
+            <w:tblW w:w="9200.0" w:type="dxa"/>
+            <w:jc w:val="left"/>
+            <w:tblBorders>
+              <w:top w:color="000000" w:space="0" w:sz="4" w:val="single"/>
+              <w:left w:color="000000" w:space="0" w:sz="4" w:val="single"/>
+              <w:bottom w:color="000000" w:space="0" w:sz="4" w:val="single"/>
+              <w:right w:color="000000" w:space="0" w:sz="4" w:val="single"/>
+              <w:insideH w:color="000000" w:space="0" w:sz="4" w:val="single"/>
+              <w:insideV w:color="000000" w:space="0" w:sz="4" w:val="single"/>
+            </w:tblBorders>
+            <w:tblLayout w:type="fixed"/>
+            <w:tblLook w:val="0000"/>
+          </w:tblPr>
+          <w:tblGrid>
+            <w:gridCol w:w="1000"/>
+            <w:gridCol w:w="7000"/>
+            <w:gridCol w:w="1200"/>
+            <w:tblGridChange w:id="0">
+              <w:tblGrid>
+                <w:gridCol w:w="1000"/>
+                <w:gridCol w:w="7000"/>
+                <w:gridCol w:w="1200"/>
+              </w:tblGrid>
+            </w:tblGridChange>
+          </w:tblGrid>
+          <w:tr>
+            <w:trPr>
+              <w:cantSplit w:val="0"/>
+              <w:tblHeader w:val="1"/>
+            </w:trPr>
+            <w:tc>
+              <w:tcPr>
+                <w:shd w:fill="d9d9d9" w:val="clear"/>
+              </w:tcPr>
+              <w:p>
+                <w:pPr>
+                  <w:spacing w:after="120" w:line="240" w:lineRule="auto"/>
+                  <w:rPr/>
+                </w:pPr>
+                <w:r>
+                  <w:rPr>
+                    <w:b w:val="1"/>
+                    <w:bCs w:val="1"/>
+                    <w:sz w:val="20"/>
+                    <w:szCs w:val="20"/>
+                    <w:rtl w:val="0"/>
+                  </w:rPr>
+                  <w:t xml:space="preserve">Req ID</w:t>
+                </w:r>
+                <w:r>
+                  <w:rPr>
+                    <w:rtl w:val="0"/>
+                  </w:rPr>
+                </w:r>
+              </w:p>
+            </w:tc>
+            <w:tc>
+              <w:tcPr>
+                <w:shd w:fill="d9d9d9" w:val="clear"/>
+              </w:tcPr>
+              <w:p>
+                <w:pPr>
+                  <w:spacing w:after="120" w:line="240" w:lineRule="auto"/>
+                  <w:rPr/>
+                </w:pPr>
+                <w:r>
+                  <w:rPr>
+                    <w:b w:val="1"/>
+                    <w:bCs w:val="1"/>
+                    <w:sz w:val="20"/>
+                    <w:szCs w:val="20"/>
+                    <w:rtl w:val="0"/>
+                  </w:rPr>
+                  <w:t xml:space="preserve">Requirement</w:t>
+                </w:r>
+                <w:r>
+                  <w:rPr>
+                    <w:rtl w:val="0"/>
+                  </w:rPr>
+                </w:r>
+              </w:p>
+            </w:tc>
+            <w:tc>
+              <w:tcPr>
+                <w:shd w:fill="d9d9d9" w:val="clear"/>
+              </w:tcPr>
+              <w:p>
+                <w:pPr>
+                  <w:spacing w:after="120" w:line="240" w:lineRule="auto"/>
+                  <w:rPr/>
+                </w:pPr>
+                <w:r>
+                  <w:rPr>
+                    <w:b w:val="1"/>
+                    <w:bCs w:val="1"/>
+                    <w:sz w:val="20"/>
+                    <w:szCs w:val="20"/>
+                    <w:rtl w:val="0"/>
+                  </w:rPr>
+                  <w:t xml:space="preserve">Priority</w:t>
+                </w:r>
+                <w:r>
+                  <w:rPr>
+                    <w:rtl w:val="0"/>
+                  </w:rPr>
+                </w:r>
+              </w:p>
+            </w:tc>
+          </w:tr>
+          <w:tr>
+            <w:trPr>
+              <w:cantSplit w:val="0"/>
+              <w:tblHeader w:val="0"/>
+            </w:trPr>
+            <w:tc>
+              <w:tcPr>
+                <w:shd w:fill="ffffff" w:val="clear"/>
+              </w:tcPr>
+              <w:p>
+                <w:pPr>
+                  <w:spacing w:after="120" w:line="240" w:lineRule="auto"/>
+                  <w:rPr/>
+                </w:pPr>
+                <w:r>
+                  <w:rPr>
+                    <w:sz w:val="20"/>
+                    <w:szCs w:val="20"/>
+                    <w:rtl w:val="0"/>
+                  </w:rPr>
+                  <w:t xml:space="preserve">FR-13</w:t>
+                </w:r>
+                <w:r>
+                  <w:rPr>
+                    <w:rtl w:val="0"/>
+                  </w:rPr>
+                </w:r>
+              </w:p>
+            </w:tc>
+            <w:tc>
+              <w:tcPr>
+                <w:shd w:fill="ffffff" w:val="clear"/>
+              </w:tcPr>
+              <w:p>
+                <w:pPr>
+                  <w:spacing w:after="120" w:line="240" w:lineRule="auto"/>
+                  <w:rPr/>
+                </w:pPr>
+                <w:r>
+                  <w:rPr>
+                    <w:sz w:val="20"/>
+                    <w:szCs w:val="20"/>
+                    <w:rtl w:val="0"/>
+                  </w:rPr>
+                  <w:t xml:space="preserve">The system shall maintain exactly one food item on the grid during gameplay.</w:t>
+                </w:r>
+                <w:r>
+                  <w:rPr>
+                    <w:rtl w:val="0"/>
+                  </w:rPr>
+                </w:r>
+              </w:p>
+            </w:tc>
+            <w:tc>
+              <w:tcPr>
+                <w:shd w:fill="ffffff" w:val="clear"/>
+              </w:tcPr>
+              <w:p>
+                <w:pPr>
+                  <w:spacing w:after="120" w:line="240" w:lineRule="auto"/>
+                  <w:rPr/>
+                </w:pPr>
+                <w:r>
+                  <w:rPr>
+                    <w:sz w:val="20"/>
+                    <w:szCs w:val="20"/>
+                    <w:rtl w:val="0"/>
+                  </w:rPr>
+                  <w:t xml:space="preserve">High</w:t>
+                </w:r>
+                <w:r>
+                  <w:rPr>
+                    <w:rtl w:val="0"/>
+                  </w:rPr>
+                </w:r>
+              </w:p>
+            </w:tc>
+          </w:tr>
+          <w:tr>
+            <w:trPr>
+              <w:cantSplit w:val="0"/>
+              <w:tblHeader w:val="0"/>
+            </w:trPr>
+            <w:tc>
+              <w:tcPr>
+                <w:shd w:fill="ffffff" w:val="clear"/>
+              </w:tcPr>
+              <w:p>
+                <w:pPr>
+                  <w:spacing w:after="120" w:line="240" w:lineRule="auto"/>
+                  <w:rPr/>
+                </w:pPr>
+                <w:r>
+                  <w:rPr>
+                    <w:sz w:val="20"/>
+                    <w:szCs w:val="20"/>
+                    <w:rtl w:val="0"/>
+                  </w:rPr>
+                  <w:t xml:space="preserve">FR-14</w:t>
+                </w:r>
+                <w:r>
+                  <w:rPr>
+                    <w:rtl w:val="0"/>
+                  </w:rPr>
+                </w:r>
+              </w:p>
+            </w:tc>
+            <w:tc>
+              <w:tcPr>
+                <w:shd w:fill="ffffff" w:val="clear"/>
+              </w:tcPr>
+              <w:p>
+                <w:pPr>
+                  <w:spacing w:after="120" w:line="240" w:lineRule="auto"/>
+                  <w:rPr/>
+                </w:pPr>
+                <w:r>
+                  <w:rPr>
+                    <w:sz w:val="20"/>
+                    <w:szCs w:val="20"/>
+                    <w:rtl w:val="0"/>
+                  </w:rPr>
+                  <w:t xml:space="preserve">The system shall place food only on a grid cell not occupied by the snake or an obstacle.</w:t>
+                </w:r>
+                <w:r>
+                  <w:rPr>
+                    <w:rtl w:val="0"/>
+                  </w:rPr>
+                </w:r>
+              </w:p>
+            </w:tc>
+            <w:tc>
+              <w:tcPr>
+                <w:shd w:fill="ffffff" w:val="clear"/>
+              </w:tcPr>
+              <w:p>
+                <w:pPr>
+                  <w:spacing w:after="120" w:line="240" w:lineRule="auto"/>
+                  <w:rPr/>
+                </w:pPr>
+                <w:r>
+                  <w:rPr>
+                    <w:sz w:val="20"/>
+                    <w:szCs w:val="20"/>
+                    <w:rtl w:val="0"/>
+                  </w:rPr>
+                  <w:t xml:space="preserve">High</w:t>
+                </w:r>
+                <w:r>
+                  <w:rPr>
+                    <w:rtl w:val="0"/>
+                  </w:rPr>
+                </w:r>
+              </w:p>
+            </w:tc>
+          </w:tr>
+          <w:tr>
+            <w:trPr>
+              <w:cantSplit w:val="0"/>
+              <w:tblHeader w:val="0"/>
+            </w:trPr>
+            <w:tc>
+              <w:tcPr>
+                <w:shd w:fill="ffffff" w:val="clear"/>
+              </w:tcPr>
+              <w:p>
+                <w:pPr>
+                  <w:spacing w:after="120" w:line="240" w:lineRule="auto"/>
+                  <w:rPr/>
+                </w:pPr>
+                <w:r>
+                  <w:rPr>
+                    <w:sz w:val="20"/>
+                    <w:szCs w:val="20"/>
+                    <w:rtl w:val="0"/>
+                  </w:rPr>
+                  <w:t xml:space="preserve">FR-15</w:t>
+                </w:r>
+                <w:r>
+                  <w:rPr>
+                    <w:rtl w:val="0"/>
+                  </w:rPr>
+                </w:r>
+              </w:p>
+            </w:tc>
+            <w:tc>
+              <w:tcPr>
+                <w:shd w:fill="ffffff" w:val="clear"/>
+              </w:tcPr>
+              <w:p>
+                <w:pPr>
+                  <w:spacing w:after="120" w:line="240" w:lineRule="auto"/>
+                  <w:rPr/>
+                </w:pPr>
+                <w:r>
+                  <w:rPr>
+                    <w:sz w:val="20"/>
+                    <w:szCs w:val="20"/>
+                    <w:rtl w:val="0"/>
+                  </w:rPr>
+                  <w:t xml:space="preserve">The system shall add 10 points to the score whenever the snake consumes food.</w:t>
+                </w:r>
+                <w:r>
+                  <w:rPr>
+                    <w:rtl w:val="0"/>
+                  </w:rPr>
+                </w:r>
+              </w:p>
+            </w:tc>
+            <w:tc>
+              <w:tcPr>
+                <w:shd w:fill="ffffff" w:val="clear"/>
+              </w:tcPr>
+              <w:p>
+                <w:pPr>
+                  <w:spacing w:after="120" w:line="240" w:lineRule="auto"/>
+                  <w:rPr/>
+                </w:pPr>
+                <w:r>
+                  <w:rPr>
+                    <w:sz w:val="20"/>
+                    <w:szCs w:val="20"/>
+                    <w:rtl w:val="0"/>
+                  </w:rPr>
+                  <w:t xml:space="preserve">High</w:t>
+                </w:r>
+                <w:r>
+                  <w:rPr>
+                    <w:rtl w:val="0"/>
+                  </w:rPr>
+                </w:r>
+              </w:p>
+            </w:tc>
+          </w:tr>
+          <w:tr>
+            <w:trPr>
+              <w:cantSplit w:val="0"/>
+              <w:tblHeader w:val="0"/>
+            </w:trPr>
+            <w:tc>
+              <w:tcPr>
+                <w:shd w:fill="ffffff" w:val="clear"/>
+              </w:tcPr>
+              <w:p>
+                <w:pPr>
+                  <w:spacing w:after="120" w:line="240" w:lineRule="auto"/>
+                  <w:rPr/>
+                </w:pPr>
+                <w:r>
+                  <w:rPr>
+                    <w:sz w:val="20"/>
+                    <w:szCs w:val="20"/>
+                    <w:rtl w:val="0"/>
+                  </w:rPr>
+                  <w:t xml:space="preserve">FR-16</w:t>
+                </w:r>
+                <w:r>
+                  <w:rPr>
+                    <w:rtl w:val="0"/>
+                  </w:rPr>
+                </w:r>
+              </w:p>
+            </w:tc>
+            <w:tc>
+              <w:tcPr>
+                <w:shd w:fill="ffffff" w:val="clear"/>
+              </w:tcPr>
+              <w:p>
+                <w:pPr>
+                  <w:spacing w:after="120" w:line="240" w:lineRule="auto"/>
+                  <w:rPr/>
+                </w:pPr>
+                <w:r>
+                  <w:rPr>
+                    <w:sz w:val="20"/>
+                    <w:szCs w:val="20"/>
+                    <w:rtl w:val="0"/>
+                  </w:rPr>
+                  <w:t xml:space="preserve">The system shall grow the snake by one segment whenever it consumes food.</w:t>
+                </w:r>
+                <w:r>
+                  <w:rPr>
+                    <w:rtl w:val="0"/>
+                  </w:rPr>
+                </w:r>
+              </w:p>
+            </w:tc>
+            <w:tc>
+              <w:tcPr>
+                <w:shd w:fill="ffffff" w:val="clear"/>
+              </w:tcPr>
+              <w:p>
+                <w:pPr>
+                  <w:spacing w:after="120" w:line="240" w:lineRule="auto"/>
+                  <w:rPr/>
+                </w:pPr>
+                <w:r>
+                  <w:rPr>
+                    <w:sz w:val="20"/>
+                    <w:szCs w:val="20"/>
+                    <w:rtl w:val="0"/>
+                  </w:rPr>
+                  <w:t xml:space="preserve">High</w:t>
+                </w:r>
+                <w:r>
+                  <w:rPr>
+                    <w:rtl w:val="0"/>
+                  </w:rPr>
+                </w:r>
+              </w:p>
+            </w:tc>
+          </w:tr>
+          <w:tr>
+            <w:trPr>
+              <w:cantSplit w:val="0"/>
+              <w:tblHeader w:val="0"/>
+            </w:trPr>
+            <w:tc>
+              <w:tcPr>
+                <w:shd w:fill="ffffff" w:val="clear"/>
+              </w:tcPr>
+              <w:p>
+                <w:pPr>
+                  <w:spacing w:after="120" w:line="240" w:lineRule="auto"/>
+                  <w:rPr/>
+                </w:pPr>
+                <w:r>
+                  <w:rPr>
+                    <w:sz w:val="20"/>
+                    <w:szCs w:val="20"/>
+                    <w:rtl w:val="0"/>
+                  </w:rPr>
+                  <w:t xml:space="preserve">FR-17</w:t>
+                </w:r>
+                <w:r>
+                  <w:rPr>
+                    <w:rtl w:val="0"/>
+                  </w:rPr>
+                </w:r>
+              </w:p>
+            </w:tc>
+            <w:tc>
+              <w:tcPr>
+                <w:shd w:fill="ffffff" w:val="clear"/>
+              </w:tcPr>
+              <w:p>
+                <w:pPr>
+                  <w:spacing w:after="120" w:line="240" w:lineRule="auto"/>
+                  <w:rPr/>
+                </w:pPr>
+                <w:r>
+                  <w:rPr>
+                    <w:sz w:val="20"/>
+                    <w:szCs w:val="20"/>
+                    <w:rtl w:val="0"/>
+                  </w:rPr>
+                  <w:t xml:space="preserve">The system shall update and display the current score in the HUD immediately after food is consumed.</w:t>
+                </w:r>
+                <w:r>
+                  <w:rPr>
+                    <w:rtl w:val="0"/>
+                  </w:rPr>
+                </w:r>
+              </w:p>
+            </w:tc>
+            <w:tc>
+              <w:tcPr>
+                <w:shd w:fill="ffffff" w:val="clear"/>
+              </w:tcPr>
+              <w:p>
+                <w:pPr>
+                  <w:spacing w:after="120" w:line="240" w:lineRule="auto"/>
+                  <w:rPr/>
+                </w:pPr>
+                <w:r>
+                  <w:rPr>
+                    <w:sz w:val="20"/>
+                    <w:szCs w:val="20"/>
+                    <w:rtl w:val="0"/>
+                  </w:rPr>
+                  <w:t xml:space="preserve">High</w:t>
+                </w:r>
+                <w:r>
+                  <w:rPr>
+                    <w:rtl w:val="0"/>
+                  </w:rPr>
+                </w:r>
+              </w:p>
+            </w:tc>
+          </w:tr>
+          <w:tr>
+            <w:trPr>
+              <w:cantSplit w:val="0"/>
+              <w:tblHeader w:val="0"/>
+            </w:trPr>
+            <w:tc>
+              <w:tcPr>
+                <w:shd w:fill="ffffff" w:val="clear"/>
+              </w:tcPr>
+              <w:p>
+                <w:pPr>
+                  <w:spacing w:after="120" w:line="240" w:lineRule="auto"/>
+                  <w:rPr/>
+                </w:pPr>
+                <w:r>
+                  <w:rPr>
+                    <w:sz w:val="20"/>
+                    <w:szCs w:val="20"/>
+                    <w:rtl w:val="0"/>
+                  </w:rPr>
+                  <w:t xml:space="preserve">FR-18</w:t>
+                </w:r>
+                <w:r>
+                  <w:rPr>
+                    <w:rtl w:val="0"/>
+                  </w:rPr>
+                </w:r>
+              </w:p>
+            </w:tc>
+            <w:tc>
+              <w:tcPr>
+                <w:shd w:fill="ffffff" w:val="clear"/>
+              </w:tcPr>
+              <w:p>
+                <w:pPr>
+                  <w:spacing w:after="120" w:line="240" w:lineRule="auto"/>
+                  <w:rPr/>
+                </w:pPr>
+                <w:r>
+                  <w:rPr>
+                    <w:sz w:val="20"/>
+                    <w:szCs w:val="20"/>
+                    <w:rtl w:val="0"/>
+                  </w:rPr>
+                  <w:t xml:space="preserve">The system shall display the current high score in the HUD during gameplay.</w:t>
+                </w:r>
+                <w:r>
+                  <w:rPr>
+                    <w:rtl w:val="0"/>
+                  </w:rPr>
+                </w:r>
+              </w:p>
+            </w:tc>
+            <w:tc>
+              <w:tcPr>
+                <w:shd w:fill="ffffff" w:val="clear"/>
+              </w:tcPr>
+              <w:p>
+                <w:pPr>
+                  <w:spacing w:after="120" w:line="240" w:lineRule="auto"/>
+                  <w:rPr/>
+                </w:pPr>
+                <w:r>
+                  <w:rPr>
+                    <w:sz w:val="20"/>
+                    <w:szCs w:val="20"/>
+                    <w:rtl w:val="0"/>
+                  </w:rPr>
+                  <w:t xml:space="preserve">High</w:t>
+                </w:r>
+                <w:r>
+                  <w:rPr>
+                    <w:rtl w:val="0"/>
+                  </w:rPr>
+                </w:r>
+              </w:p>
+            </w:tc>
+          </w:tr>
+        </w:tbl>
+      </w:sdtContent>
+    </w:sdt>
+    <w:p>
+      <w:pPr>
+        <w:pStyle w:val="Heading2"/>
+        <w:keepNext w:val="0"/>
+        <w:keepLines w:val="0"/>
+        <w:spacing w:after="100" w:before="200" w:line="240" w:lineRule="auto"/>
+        <w:rPr>
+          <w:b w:val="1"/>
+          <w:bCs w:val="1"/>
+          <w:color w:val="003366"/>
+          <w:sz w:val="24"/>
+          <w:szCs w:val="24"/>
+        </w:rPr>
+      </w:pPr>
+      <w:r>
+        <w:rPr>
+          <w:b w:val="1"/>
+          <w:bCs w:val="1"/>
+          <w:color w:val="003366"/>
+          <w:sz w:val="24"/>
+          <w:szCs w:val="24"/>
+          <w:rtl w:val="0"/>
+        </w:rPr>
+        <w:t xml:space="preserve">5.4 Collision Detection and Game Over</w:t>
+      </w:r>
+    </w:p>
+    <w:p>
+      <w:pPr>
+        <w:pStyle w:val="Heading3"/>
+        <w:keepNext w:val="0"/>
+        <w:keepLines w:val="0"/>
+        <w:spacing w:before="160" w:line="240" w:lineRule="auto"/>
+        <w:rPr>
+          <w:sz w:val="22"/>
+          <w:szCs w:val="22"/>
+        </w:rPr>
+      </w:pPr>
+      <w:r>
+        <w:rPr>
+          <w:sz w:val="22"/>
+          <w:szCs w:val="22"/>
+          <w:rtl w:val="0"/>
+        </w:rPr>
+        <w:t xml:space="preserve">5.4.1 Description and Priority</w:t>
+      </w:r>
+    </w:p>
+    <w:p>
+      <w:pPr>
+        <w:spacing w:after="120" w:line="240" w:lineRule="auto"/>
+        <w:rPr/>
+      </w:pPr>
+      <w:r>
+        <w:rPr>
+          <w:rtl w:val="0"/>
+        </w:rPr>
+        <w:t xml:space="preserve">This feature detects invalid snake movement and changes the game state to GAME_OVER only after a valid wall, self, or obstacle collision. Priority: HIGH.</w:t>
+      </w:r>
+    </w:p>
+    <w:p>
+      <w:pPr>
+        <w:pStyle w:val="Heading3"/>
+        <w:keepNext w:val="0"/>
+        <w:keepLines w:val="0"/>
+        <w:spacing w:before="160" w:line="240" w:lineRule="auto"/>
+        <w:rPr>
+          <w:sz w:val="22"/>
+          <w:szCs w:val="22"/>
+        </w:rPr>
+      </w:pPr>
+      <w:r>
+        <w:rPr>
+          <w:sz w:val="22"/>
+          <w:szCs w:val="22"/>
+          <w:rtl w:val="0"/>
+        </w:rPr>
+        <w:t xml:space="preserve">5.4.2 Stimulus/Response Sequences</w:t>
+      </w:r>
+    </w:p>
+    <w:p>
+      <w:pPr>
+        <w:spacing w:after="80" w:line="240" w:lineRule="auto"/>
+        <w:ind w:left="720" w:firstLine="0"/>
+        <w:rPr/>
+      </w:pPr>
+      <w:r>
+        <w:rPr>
+          <w:b w:val="1"/>
+          <w:bCs w:val="1"/>
+          <w:rtl w:val="0"/>
+        </w:rPr>
+        <w:t xml:space="preserve">• Before each movement is committed → System checks the next snake-head position against grid boundaries, snake body, and obstacles.</w:t>
+      </w:r>
+      <w:r>
+        <w:rPr>
+          <w:rtl w:val="0"/>
+        </w:rPr>
+        <w:t xml:space="preserve"/>
+      </w:r>
+    </w:p>
+    <w:p>
+      <w:pPr>
+        <w:spacing w:after="80" w:line="240" w:lineRule="auto"/>
+        <w:ind w:left="720" w:firstLine="0"/>
+        <w:rPr/>
+      </w:pPr>
+      <w:r>
+        <w:rPr>
+          <w:b w:val="1"/>
+          <w:bCs w:val="1"/>
+          <w:rtl w:val="0"/>
+        </w:rPr>
+        <w:t xml:space="preserve">• A valid collision is detected → System stops normal gameplay and transitions to the Game Over flow.</w:t>
+      </w:r>
+      <w:r>
+        <w:rPr>
+          <w:rtl w:val="0"/>
+        </w:rPr>
+        <w:t xml:space="preserve"/>
+      </w:r>
+    </w:p>
+    <w:p>
+      <w:pPr>
+        <w:pStyle w:val="Heading3"/>
+        <w:keepNext w:val="0"/>
+        <w:keepLines w:val="0"/>
+        <w:spacing w:before="160" w:line="240" w:lineRule="auto"/>
+        <w:rPr>
+          <w:sz w:val="22"/>
+          <w:szCs w:val="22"/>
+        </w:rPr>
+      </w:pPr>
+      <w:r>
+        <w:rPr>
+          <w:sz w:val="22"/>
+          <w:szCs w:val="22"/>
+          <w:rtl w:val="0"/>
+        </w:rPr>
+        <w:t xml:space="preserve">5.4.3 Functional Requirements</w:t>
+      </w:r>
+    </w:p>
+    <w:sdt>
+      <w:sdtPr>
+        <w:lock w:val="contentLocked"/>
+        <w:id w:val="-122314717"/>
+        <w:tag w:val="goog_rdk_7"/>
+      </w:sdtPr>
+      <w:sdtContent>
+        <w:tbl>
+          <w:tblPr>
+            <w:tblStyle w:val="Table10"/>
+            <w:tblW w:w="9200.0" w:type="dxa"/>
+            <w:jc w:val="left"/>
+            <w:tblBorders>
+              <w:top w:color="000000" w:space="0" w:sz="4" w:val="single"/>
+              <w:left w:color="000000" w:space="0" w:sz="4" w:val="single"/>
+              <w:bottom w:color="000000" w:space="0" w:sz="4" w:val="single"/>
+              <w:right w:color="000000" w:space="0" w:sz="4" w:val="single"/>
+              <w:insideH w:color="000000" w:space="0" w:sz="4" w:val="single"/>
+              <w:insideV w:color="000000" w:space="0" w:sz="4" w:val="single"/>
+            </w:tblBorders>
+            <w:tblLayout w:type="fixed"/>
+            <w:tblLook w:val="0000"/>
+          </w:tblPr>
+          <w:tblGrid>
+            <w:gridCol w:w="1000"/>
+            <w:gridCol w:w="7000"/>
+            <w:gridCol w:w="1200"/>
+            <w:tblGridChange w:id="0">
+              <w:tblGrid>
+                <w:gridCol w:w="1000"/>
+                <w:gridCol w:w="7000"/>
+                <w:gridCol w:w="1200"/>
+              </w:tblGrid>
+            </w:tblGridChange>
+          </w:tblGrid>
+          <w:tr>
+            <w:trPr>
+              <w:cantSplit w:val="0"/>
+              <w:tblHeader w:val="1"/>
+            </w:trPr>
+            <w:tc>
+              <w:tcPr>
+                <w:shd w:fill="d9d9d9" w:val="clear"/>
+              </w:tcPr>
+              <w:p>
+                <w:pPr>
+                  <w:spacing w:after="120" w:line="240" w:lineRule="auto"/>
+                  <w:rPr/>
+                </w:pPr>
+                <w:r>
+                  <w:rPr>
+                    <w:b w:val="1"/>
+                    <w:bCs w:val="1"/>
+                    <w:sz w:val="20"/>
+                    <w:szCs w:val="20"/>
+                    <w:rtl w:val="0"/>
+                  </w:rPr>
+                  <w:t xml:space="preserve">Req ID</w:t>
+                </w:r>
+                <w:r>
+                  <w:rPr>
+                    <w:rtl w:val="0"/>
+                  </w:rPr>
+                </w:r>
+              </w:p>
+            </w:tc>
+            <w:tc>
+              <w:tcPr>
+                <w:shd w:fill="d9d9d9" w:val="clear"/>
+              </w:tcPr>
+              <w:p>
+                <w:pPr>
+                  <w:spacing w:after="120" w:line="240" w:lineRule="auto"/>
+                  <w:rPr/>
+                </w:pPr>
+                <w:r>
+                  <w:rPr>
+                    <w:b w:val="1"/>
+                    <w:bCs w:val="1"/>
+                    <w:sz w:val="20"/>
+                    <w:szCs w:val="20"/>
+                    <w:rtl w:val="0"/>
+                  </w:rPr>
+                  <w:t xml:space="preserve">Requirement</w:t>
+                </w:r>
+                <w:r>
+                  <w:rPr>
+                    <w:rtl w:val="0"/>
+                  </w:rPr>
+                </w:r>
+              </w:p>
+            </w:tc>
+            <w:tc>
+              <w:tcPr>
+                <w:shd w:fill="d9d9d9" w:val="clear"/>
+              </w:tcPr>
+              <w:p>
+                <w:pPr>
+                  <w:spacing w:after="120" w:line="240" w:lineRule="auto"/>
+                  <w:rPr/>
+                </w:pPr>
+                <w:r>
+                  <w:rPr>
+                    <w:b w:val="1"/>
+                    <w:bCs w:val="1"/>
+                    <w:sz w:val="20"/>
+                    <w:szCs w:val="20"/>
+                    <w:rtl w:val="0"/>
+                  </w:rPr>
+                  <w:t xml:space="preserve">Priority</w:t>
+                </w:r>
+                <w:r>
+                  <w:rPr>
+                    <w:rtl w:val="0"/>
+                  </w:rPr>
+                </w:r>
+              </w:p>
+            </w:tc>
+          </w:tr>
+          <w:tr>
+            <w:trPr>
+              <w:cantSplit w:val="0"/>
+              <w:tblHeader w:val="0"/>
+            </w:trPr>
+            <w:tc>
+              <w:tcPr>
+                <w:shd w:fill="ffffff" w:val="clear"/>
+              </w:tcPr>
+              <w:p>
+                <w:pPr>
+                  <w:spacing w:after="120" w:line="240" w:lineRule="auto"/>
+                  <w:rPr/>
+                </w:pPr>
+                <w:r>
+                  <w:rPr>
+                    <w:sz w:val="20"/>
+                    <w:szCs w:val="20"/>
+                    <w:rtl w:val="0"/>
+                  </w:rPr>
+                  <w:t xml:space="preserve">FR-19</w:t>
+                </w:r>
+                <w:r>
+                  <w:rPr>
+                    <w:rtl w:val="0"/>
+                  </w:rPr>
+                </w:r>
+              </w:p>
+            </w:tc>
+            <w:tc>
+              <w:tcPr>
+                <w:shd w:fill="ffffff" w:val="clear"/>
+              </w:tcPr>
+              <w:p>
+                <w:pPr>
+                  <w:spacing w:after="120" w:line="240" w:lineRule="auto"/>
+                  <w:rPr/>
+                </w:pPr>
+                <w:r>
+                  <w:rPr>
+                    <w:sz w:val="20"/>
+                    <w:szCs w:val="20"/>
+                    <w:rtl w:val="0"/>
+                  </w:rPr>
+                  <w:t xml:space="preserve">The system shall transition to GAME_OVER when the snake head moves outside the game grid boundary.</w:t>
+                </w:r>
+                <w:r>
+                  <w:rPr>
+                    <w:rtl w:val="0"/>
+                  </w:rPr>
+                </w:r>
+              </w:p>
+            </w:tc>
+            <w:tc>
+              <w:tcPr>
+                <w:shd w:fill="ffffff" w:val="clear"/>
+              </w:tcPr>
+              <w:p>
+                <w:pPr>
+                  <w:spacing w:after="120" w:line="240" w:lineRule="auto"/>
+                  <w:rPr/>
+                </w:pPr>
+                <w:r>
+                  <w:rPr>
+                    <w:sz w:val="20"/>
+                    <w:szCs w:val="20"/>
+                    <w:rtl w:val="0"/>
+                  </w:rPr>
+                  <w:t xml:space="preserve">High</w:t>
+                </w:r>
+                <w:r>
+                  <w:rPr>
+                    <w:rtl w:val="0"/>
+                  </w:rPr>
+                </w:r>
+              </w:p>
+            </w:tc>
+          </w:tr>
+          <w:tr>
+            <w:trPr>
+              <w:cantSplit w:val="0"/>
+              <w:tblHeader w:val="0"/>
+            </w:trPr>
+            <w:tc>
+              <w:tcPr>
+                <w:shd w:fill="ffffff" w:val="clear"/>
+              </w:tcPr>
+              <w:p>
+                <w:pPr>
+                  <w:spacing w:after="120" w:line="240" w:lineRule="auto"/>
+                  <w:rPr/>
+                </w:pPr>
+                <w:r>
+                  <w:rPr>
+                    <w:sz w:val="20"/>
+                    <w:szCs w:val="20"/>
+                    <w:rtl w:val="0"/>
+                  </w:rPr>
+                  <w:t xml:space="preserve">FR-20</w:t>
+                </w:r>
+                <w:r>
+                  <w:rPr>
+                    <w:rtl w:val="0"/>
+                  </w:rPr>
+                </w:r>
+              </w:p>
+            </w:tc>
+            <w:tc>
+              <w:tcPr>
+                <w:shd w:fill="ffffff" w:val="clear"/>
+              </w:tcPr>
+              <w:p>
+                <w:pPr>
+                  <w:spacing w:after="120" w:line="240" w:lineRule="auto"/>
+                  <w:rPr/>
+                </w:pPr>
+                <w:r>
+                  <w:rPr>
+                    <w:sz w:val="20"/>
+                    <w:szCs w:val="20"/>
+                    <w:rtl w:val="0"/>
+                  </w:rPr>
+                  <w:t xml:space="preserve">The system shall transition to GAME_OVER when the snake head collides with its own body.</w:t>
+                </w:r>
+                <w:r>
+                  <w:rPr>
+                    <w:rtl w:val="0"/>
+                  </w:rPr>
+                </w:r>
+              </w:p>
+            </w:tc>
+            <w:tc>
+              <w:tcPr>
+                <w:shd w:fill="ffffff" w:val="clear"/>
+              </w:tcPr>
+              <w:p>
+                <w:pPr>
+                  <w:spacing w:after="120" w:line="240" w:lineRule="auto"/>
+                  <w:rPr/>
+                </w:pPr>
+                <w:r>
+                  <w:rPr>
+                    <w:sz w:val="20"/>
+                    <w:szCs w:val="20"/>
+                    <w:rtl w:val="0"/>
+                  </w:rPr>
+                  <w:t xml:space="preserve">High</w:t>
+                </w:r>
+                <w:r>
+                  <w:rPr>
+                    <w:rtl w:val="0"/>
+                  </w:rPr>
+                </w:r>
+              </w:p>
+            </w:tc>
+          </w:tr>
+          <w:tr>
+            <w:trPr>
+              <w:cantSplit w:val="0"/>
+              <w:tblHeader w:val="0"/>
+            </w:trPr>
+            <w:tc>
+              <w:tcPr>
+                <w:shd w:fill="ffffff" w:val="clear"/>
+              </w:tcPr>
+              <w:p>
+                <w:pPr>
+                  <w:spacing w:after="120" w:line="240" w:lineRule="auto"/>
+                  <w:rPr/>
+                </w:pPr>
+                <w:r>
+                  <w:rPr>
+                    <w:sz w:val="20"/>
+                    <w:szCs w:val="20"/>
+                    <w:rtl w:val="0"/>
+                  </w:rPr>
+                  <w:t xml:space="preserve">FR-21</w:t>
+                </w:r>
+                <w:r>
+                  <w:rPr>
+                    <w:rtl w:val="0"/>
+                  </w:rPr>
+                </w:r>
+              </w:p>
+            </w:tc>
+            <w:tc>
+              <w:tcPr>
+                <w:shd w:fill="ffffff" w:val="clear"/>
+              </w:tcPr>
+              <w:p>
+                <w:pPr>
+                  <w:spacing w:after="120" w:line="240" w:lineRule="auto"/>
+                  <w:rPr/>
+                </w:pPr>
+                <w:r>
+                  <w:rPr>
+                    <w:sz w:val="20"/>
+                    <w:szCs w:val="20"/>
+                    <w:rtl w:val="0"/>
+                  </w:rPr>
+                  <w:t xml:space="preserve">The system shall transition to GAME_OVER when the snake head collides with an obstacle.</w:t>
+                </w:r>
+                <w:r>
+                  <w:rPr>
+                    <w:rtl w:val="0"/>
+                  </w:rPr>
+                </w:r>
+              </w:p>
+            </w:tc>
+            <w:tc>
+              <w:tcPr>
+                <w:shd w:fill="ffffff" w:val="clear"/>
+              </w:tcPr>
+              <w:p>
+                <w:pPr>
+                  <w:spacing w:after="120" w:line="240" w:lineRule="auto"/>
+                  <w:rPr/>
+                </w:pPr>
+                <w:r>
+                  <w:rPr>
+                    <w:sz w:val="20"/>
+                    <w:szCs w:val="20"/>
+                    <w:rtl w:val="0"/>
+                  </w:rPr>
+                  <w:t xml:space="preserve">High</w:t>
+                </w:r>
+                <w:r>
+                  <w:rPr>
+                    <w:rtl w:val="0"/>
+                  </w:rPr>
+                </w:r>
+              </w:p>
+            </w:tc>
+          </w:tr>
+          <w:tr>
+            <w:trPr>
+              <w:cantSplit w:val="0"/>
+              <w:tblHeader w:val="0"/>
+            </w:trPr>
+            <w:tc>
+              <w:tcPr>
+                <w:shd w:fill="ffffff" w:val="clear"/>
+              </w:tcPr>
+              <w:p>
+                <w:pPr>
+                  <w:spacing w:after="120" w:line="240" w:lineRule="auto"/>
+                  <w:rPr/>
+                </w:pPr>
+                <w:r>
+                  <w:rPr>
+                    <w:sz w:val="20"/>
+                    <w:szCs w:val="20"/>
+                    <w:rtl w:val="0"/>
+                  </w:rPr>
+                  <w:t xml:space="preserve">FR-22</w:t>
+                </w:r>
+                <w:r>
+                  <w:rPr>
+                    <w:rtl w:val="0"/>
+                  </w:rPr>
+                </w:r>
+              </w:p>
+            </w:tc>
+            <w:tc>
+              <w:tcPr>
+                <w:shd w:fill="ffffff" w:val="clear"/>
+              </w:tcPr>
+              <w:p>
+                <w:pPr>
+                  <w:spacing w:after="120" w:line="240" w:lineRule="auto"/>
+                  <w:rPr/>
+                </w:pPr>
+                <w:r>
+                  <w:rPr>
+                    <w:sz w:val="20"/>
+                    <w:szCs w:val="20"/>
+                    <w:rtl w:val="0"/>
+                  </w:rPr>
+                  <w:t xml:space="preserve">The system shall evaluate wall, self, and obstacle collision conditions on every movement tick.</w:t>
+                </w:r>
+                <w:r>
+                  <w:rPr>
+                    <w:rtl w:val="0"/>
+                  </w:rPr>
+                </w:r>
+              </w:p>
+            </w:tc>
+            <w:tc>
+              <w:tcPr>
+                <w:shd w:fill="ffffff" w:val="clear"/>
+              </w:tcPr>
+              <w:p>
+                <w:pPr>
+                  <w:spacing w:after="120" w:line="240" w:lineRule="auto"/>
+                  <w:rPr/>
+                </w:pPr>
+                <w:r>
+                  <w:rPr>
+                    <w:sz w:val="20"/>
+                    <w:szCs w:val="20"/>
+                    <w:rtl w:val="0"/>
+                  </w:rPr>
+                  <w:t xml:space="preserve">High</w:t>
+                </w:r>
+                <w:r>
+                  <w:rPr>
+                    <w:rtl w:val="0"/>
+                  </w:rPr>
+                </w:r>
+              </w:p>
+            </w:tc>
+          </w:tr>
+          <w:tr>
+            <w:trPr>
+              <w:cantSplit w:val="0"/>
+              <w:tblHeader w:val="0"/>
+            </w:trPr>
+            <w:tc>
+              <w:tcPr>
+                <w:shd w:fill="ffffff" w:val="clear"/>
+              </w:tcPr>
+              <w:p>
+                <w:pPr>
+                  <w:spacing w:after="120" w:line="240" w:lineRule="auto"/>
+                  <w:rPr/>
+                </w:pPr>
+                <w:r>
+                  <w:rPr>
+                    <w:sz w:val="20"/>
+                    <w:szCs w:val="20"/>
+                    <w:rtl w:val="0"/>
+                  </w:rPr>
+                  <w:t xml:space="preserve">FR-23</w:t>
+                </w:r>
+                <w:r>
+                  <w:rPr>
+                    <w:rtl w:val="0"/>
+                  </w:rPr>
+                </w:r>
+              </w:p>
+            </w:tc>
+            <w:tc>
+              <w:tcPr>
+                <w:shd w:fill="ffffff" w:val="clear"/>
+              </w:tcPr>
+              <w:p>
+                <w:pPr>
+                  <w:spacing w:after="120" w:line="240" w:lineRule="auto"/>
+                  <w:rPr/>
+                </w:pPr>
+                <w:r>
+                  <w:rPr>
+                    <w:sz w:val="20"/>
+                    <w:szCs w:val="20"/>
+                    <w:rtl w:val="0"/>
+                  </w:rPr>
+                  <w:t xml:space="preserve">The system shall not transition to GAME_OVER during normal valid movement, including movement into the cell vacated by the tail when the snake does not grow.</w:t>
+                </w:r>
+                <w:r>
+                  <w:rPr>
+                    <w:rtl w:val="0"/>
+                  </w:rPr>
+                </w:r>
+              </w:p>
+            </w:tc>
+            <w:tc>
+              <w:tcPr>
+                <w:shd w:fill="ffffff" w:val="clear"/>
+              </w:tcPr>
+              <w:p>
+                <w:pPr>
+                  <w:spacing w:after="120" w:line="240" w:lineRule="auto"/>
+                  <w:rPr/>
+                </w:pPr>
+                <w:r>
+                  <w:rPr>
+                    <w:sz w:val="20"/>
+                    <w:szCs w:val="20"/>
+                    <w:rtl w:val="0"/>
+                  </w:rPr>
+                  <w:t xml:space="preserve">High</w:t>
+                </w:r>
+                <w:r>
+                  <w:rPr>
+                    <w:rtl w:val="0"/>
+                  </w:rPr>
+                </w:r>
+              </w:p>
+            </w:tc>
+          </w:tr>
+        </w:tbl>
+      </w:sdtContent>
+    </w:sdt>
+    <w:p>
+      <w:pPr>
+        <w:pStyle w:val="Heading2"/>
+        <w:keepNext w:val="0"/>
+        <w:keepLines w:val="0"/>
+        <w:spacing w:after="100" w:before="200" w:line="240" w:lineRule="auto"/>
+        <w:rPr>
+          <w:b w:val="1"/>
+          <w:bCs w:val="1"/>
+          <w:color w:val="003366"/>
+          <w:sz w:val="24"/>
+          <w:szCs w:val="24"/>
+        </w:rPr>
+      </w:pPr>
+      <w:r>
+        <w:rPr>
+          <w:b w:val="1"/>
+          <w:bCs w:val="1"/>
+          <w:color w:val="003366"/>
+          <w:sz w:val="24"/>
+          <w:szCs w:val="24"/>
+          <w:rtl w:val="0"/>
+        </w:rPr>
         <w:t xml:space="preserve">5.5 Level Progression and Difficulty</w:t>
       </w:r>
     </w:p>

</xml_diff>